<commit_message>
retour sur le portable
</commit_message>
<xml_diff>
--- a/public/diplome.docx
+++ b/public/diplome.docx
@@ -733,14 +733,34 @@
       <w:pPr>
         <w:jc w:val="right"/>
       </w:pPr>
+    </w:p>
+    <w:p/>
+    <w:p/>
+    <w:p/>
+    <w:p/>
+    <w:p/>
+    <w:p/>
+    <w:p/>
+    <w:p/>
+    <w:p/>
+    <w:p/>
+    <w:p>
       <w:r>
         <w:rPr>
           <w:noProof/>
         </w:rPr>
         <w:drawing>
-          <wp:inline distT="0" distB="0" distL="0" distR="0" wp14:anchorId="5E5A6660" wp14:editId="56BE9754">
-            <wp:extent cx="3268658" cy="2019300"/>
-            <wp:effectExtent l="0" t="0" r="8255" b="0"/>
+          <wp:anchor distT="0" distB="0" distL="114300" distR="114300" simplePos="0" relativeHeight="251660288" behindDoc="1" locked="0" layoutInCell="1" allowOverlap="1" wp14:anchorId="5E5A6660" wp14:editId="773BF7AE">
+            <wp:simplePos x="0" y="0"/>
+            <wp:positionH relativeFrom="column">
+              <wp:posOffset>3198495</wp:posOffset>
+            </wp:positionH>
+            <wp:positionV relativeFrom="paragraph">
+              <wp:posOffset>1758315</wp:posOffset>
+            </wp:positionV>
+            <wp:extent cx="2300605" cy="1421260"/>
+            <wp:effectExtent l="0" t="0" r="4445" b="7620"/>
+            <wp:wrapNone/>
             <wp:docPr id="116609586" name="Image 2"/>
             <wp:cNvGraphicFramePr>
               <a:graphicFrameLocks xmlns:a="http://schemas.openxmlformats.org/drawingml/2006/main" noChangeAspect="1"/>
@@ -770,7 +790,7 @@
                   <pic:spPr bwMode="auto">
                     <a:xfrm>
                       <a:off x="0" y="0"/>
-                      <a:ext cx="3271485" cy="2021047"/>
+                      <a:ext cx="2300605" cy="1421260"/>
                     </a:xfrm>
                     <a:prstGeom prst="rect">
                       <a:avLst/>
@@ -783,21 +803,16 @@
                 </pic:pic>
               </a:graphicData>
             </a:graphic>
-          </wp:inline>
+            <wp14:sizeRelH relativeFrom="margin">
+              <wp14:pctWidth>0</wp14:pctWidth>
+            </wp14:sizeRelH>
+            <wp14:sizeRelV relativeFrom="margin">
+              <wp14:pctHeight>0</wp14:pctHeight>
+            </wp14:sizeRelV>
+          </wp:anchor>
         </w:drawing>
       </w:r>
     </w:p>
-    <w:p/>
-    <w:p/>
-    <w:p/>
-    <w:p/>
-    <w:p/>
-    <w:p/>
-    <w:p/>
-    <w:p/>
-    <w:p/>
-    <w:p/>
-    <w:p/>
     <w:p>
       <w:r>
         <w:rPr>

</xml_diff>